<commit_message>
Update CV and Resume for Eduardo Edson Batista Cordeiro Alves: Enhanced job titles, refined descriptions of professional experience, and added new skills and technologies. Created interview scripts in English and Portuguese for upcoming interviews. Updated personal website content to reflect current expertise and projects.
</commit_message>
<xml_diff>
--- a/Assets/files/CV - Eduardo Edson Batista Cordeiro Alves.docx
+++ b/Assets/files/CV - Eduardo Edson Batista Cordeiro Alves.docx
@@ -13,34 +13,35 @@
     </w:p>
     <w:p>
       <w:pPr>
-        <w:pStyle w:val="NoSpacing"/>
+        <w:spacing w:after="0" w:line="240" w:lineRule="auto"/>
         <w:jc w:val="center"/>
         <w:rPr>
-          <w:sz w:val="20"/>
-          <w:szCs w:val="20"/>
+          <w:sz w:val="18"/>
+          <w:szCs w:val="18"/>
         </w:rPr>
       </w:pPr>
       <w:r>
         <w:rPr>
-          <w:sz w:val="20"/>
-          <w:szCs w:val="20"/>
+          <w:sz w:val="18"/>
+          <w:szCs w:val="18"/>
         </w:rPr>
-        <w:t>FullStack Software Engineer</w:t>
+        <w:t>Senior Full Stack Software Engineer | React, Node.js, Python, TypeScript, AWS</w:t>
       </w:r>
     </w:p>
     <w:p>
       <w:pPr>
+        <w:spacing w:after="0" w:line="240" w:lineRule="auto"/>
         <w:jc w:val="center"/>
         <w:rPr>
-          <w:sz w:val="20"/>
-          <w:szCs w:val="20"/>
+          <w:sz w:val="18"/>
+          <w:szCs w:val="18"/>
           <w:lang w:val="pt-BR"/>
         </w:rPr>
       </w:pPr>
       <w:r>
         <w:rPr>
-          <w:sz w:val="20"/>
-          <w:szCs w:val="20"/>
+          <w:sz w:val="18"/>
+          <w:szCs w:val="18"/>
           <w:lang w:val="pt-BR"/>
         </w:rPr>
         <w:t xml:space="preserve">Sintra, Portugal | </w:t>
@@ -49,8 +50,8 @@
         <w:r>
           <w:rPr>
             <w:rStyle w:val="Hyperlink"/>
-            <w:sz w:val="20"/>
-            <w:szCs w:val="20"/>
+            <w:sz w:val="18"/>
+            <w:szCs w:val="18"/>
             <w:lang w:val="pt-BR"/>
           </w:rPr>
           <w:t>work@eduardoalves.tech</w:t>
@@ -58,45 +59,146 @@
       </w:hyperlink>
       <w:r>
         <w:rPr>
-          <w:sz w:val="20"/>
-          <w:szCs w:val="20"/>
+          <w:sz w:val="18"/>
+          <w:szCs w:val="18"/>
           <w:lang w:val="pt-BR"/>
         </w:rPr>
         <w:t xml:space="preserve"> </w:t>
       </w:r>
       <w:r>
         <w:rPr>
-          <w:sz w:val="20"/>
-          <w:szCs w:val="20"/>
+          <w:sz w:val="18"/>
+          <w:szCs w:val="18"/>
           <w:lang w:val="pt-BR"/>
         </w:rPr>
         <w:t>|</w:t>
       </w:r>
       <w:r>
         <w:rPr>
-          <w:sz w:val="20"/>
-          <w:szCs w:val="20"/>
+          <w:sz w:val="18"/>
+          <w:szCs w:val="18"/>
           <w:lang w:val="pt-BR"/>
         </w:rPr>
-        <w:t xml:space="preserve"> +351 913932901 </w:t>
+        <w:t xml:space="preserve"> +351 913</w:t>
       </w:r>
       <w:r>
         <w:rPr>
-          <w:sz w:val="20"/>
-          <w:szCs w:val="20"/>
+          <w:sz w:val="18"/>
+          <w:szCs w:val="18"/>
           <w:lang w:val="pt-BR"/>
         </w:rPr>
-        <w:t xml:space="preserve">| </w:t>
+        <w:t xml:space="preserve"> </w:t>
       </w:r>
+      <w:r>
+        <w:rPr>
+          <w:sz w:val="18"/>
+          <w:szCs w:val="18"/>
+          <w:lang w:val="pt-BR"/>
+        </w:rPr>
+        <w:t>932</w:t>
+      </w:r>
+      <w:r>
+        <w:rPr>
+          <w:sz w:val="18"/>
+          <w:szCs w:val="18"/>
+          <w:lang w:val="pt-BR"/>
+        </w:rPr>
+        <w:t xml:space="preserve"> </w:t>
+      </w:r>
+      <w:r>
+        <w:rPr>
+          <w:sz w:val="18"/>
+          <w:szCs w:val="18"/>
+          <w:lang w:val="pt-BR"/>
+        </w:rPr>
+        <w:t>901</w:t>
+      </w:r>
+    </w:p>
+    <w:p>
+      <w:pPr>
+        <w:spacing w:after="0" w:line="240" w:lineRule="auto"/>
+        <w:jc w:val="center"/>
+        <w:rPr>
+          <w:sz w:val="16"/>
+          <w:szCs w:val="16"/>
+          <w:lang w:val="pt-BR"/>
+        </w:rPr>
+      </w:pPr>
+    </w:p>
+    <w:p>
+      <w:pPr>
+        <w:spacing w:after="0" w:line="240" w:lineRule="auto"/>
+        <w:jc w:val="center"/>
+        <w:rPr>
+          <w:sz w:val="18"/>
+          <w:szCs w:val="18"/>
+        </w:rPr>
+      </w:pPr>
       <w:hyperlink r:id="rId7" w:history="1">
         <w:r>
           <w:rPr>
             <w:rStyle w:val="Hyperlink"/>
-            <w:sz w:val="20"/>
-            <w:szCs w:val="20"/>
-            <w:lang w:val="pt-BR"/>
+            <w:sz w:val="18"/>
+            <w:szCs w:val="18"/>
+          </w:rPr>
+          <w:t>Website</w:t>
+        </w:r>
+        <w:r>
+          <w:rPr>
+            <w:rStyle w:val="Hyperlink"/>
+            <w:sz w:val="18"/>
+            <w:szCs w:val="18"/>
+          </w:rPr>
+          <w:t xml:space="preserve">: </w:t>
+        </w:r>
+        <w:r>
+          <w:rPr>
+            <w:rStyle w:val="Hyperlink"/>
+            <w:sz w:val="18"/>
+            <w:szCs w:val="18"/>
           </w:rPr>
           <w:t>https://eduardoalves.tech</w:t>
+        </w:r>
+      </w:hyperlink>
+      <w:r>
+        <w:rPr>
+          <w:sz w:val="18"/>
+          <w:szCs w:val="18"/>
+        </w:rPr>
+        <w:t xml:space="preserve"> | </w:t>
+      </w:r>
+      <w:hyperlink r:id="rId8" w:history="1">
+        <w:r>
+          <w:rPr>
+            <w:rStyle w:val="Hyperlink"/>
+            <w:sz w:val="18"/>
+            <w:szCs w:val="18"/>
+          </w:rPr>
+          <w:t>LinkdIn: https://www.linkedin.com/in/eduardo-edson-147339136</w:t>
+        </w:r>
+      </w:hyperlink>
+      <w:r>
+        <w:rPr>
+          <w:sz w:val="18"/>
+          <w:szCs w:val="18"/>
+        </w:rPr>
+        <w:t xml:space="preserve"> </w:t>
+      </w:r>
+      <w:r>
+        <w:rPr>
+          <w:sz w:val="18"/>
+          <w:szCs w:val="18"/>
+        </w:rPr>
+        <w:t xml:space="preserve">| </w:t>
+      </w:r>
+      <w:hyperlink r:id="rId9" w:history="1">
+        <w:r>
+          <w:rPr>
+            <w:rStyle w:val="Hyperlink"/>
+            <w:sz w:val="18"/>
+            <w:szCs w:val="18"/>
+          </w:rPr>
+          <w:t>GitHub: https://github.com/eduardoedson</w:t>
         </w:r>
       </w:hyperlink>
     </w:p>
@@ -120,30 +222,206 @@
           <w:sz w:val="20"/>
           <w:szCs w:val="20"/>
         </w:rPr>
-        <w:t>FullStack Software Engineer with 10+ years of experience in web and mobile development. Strong expertise in React, Node.js, Python, TypeScript, and modern frameworks. Skilled in building APIs, migrating legacy systems, internationalization, and delivering scalable solutions in Agile environments (Scrum/Kanban).</w:t>
+        <w:t xml:space="preserve">Full Stack Software Engineer with 10+ years of experience building web and mobile applications using React, Node.js, </w:t>
+      </w:r>
+      <w:proofErr w:type="spellStart"/>
+      <w:r>
+        <w:rPr>
+          <w:sz w:val="20"/>
+          <w:szCs w:val="20"/>
+        </w:rPr>
+        <w:t>NestJS</w:t>
+      </w:r>
+      <w:proofErr w:type="spellEnd"/>
+      <w:r>
+        <w:rPr>
+          <w:sz w:val="20"/>
+          <w:szCs w:val="20"/>
+        </w:rPr>
+        <w:t>, Next.js, Python, and TypeScript. Skilled in REST API design, relational and non-relational databases (PostgreSQL, MySQL, MongoDB), and cloud infrastructure including AWS (S3, Lambda, EC2) and Azure AD. Experienced with CI/CD pipelines (Docker, GitHub Actions) and Agile/Scrum/Kanban delivery across enterprise, telecom, and public-sector projects, including legacy system migrations and platform internationalization. Native Portuguese speaker, fluent in English (C1).</w:t>
+      </w:r>
+    </w:p>
+    <w:p>
+      <w:pPr>
+        <w:pStyle w:val="Heading1"/>
+      </w:pPr>
+      <w:r>
+        <w:t>Professional Experience</w:t>
+      </w:r>
+    </w:p>
+    <w:p>
+      <w:pPr>
+        <w:pStyle w:val="Heading3"/>
+      </w:pPr>
+      <w:proofErr w:type="spellStart"/>
+      <w:r>
+        <w:t>FullStack</w:t>
+      </w:r>
+      <w:proofErr w:type="spellEnd"/>
+      <w:r>
+        <w:t xml:space="preserve"> Software Engineer | </w:t>
+      </w:r>
+      <w:proofErr w:type="spellStart"/>
+      <w:r>
+        <w:t>Glintt</w:t>
+      </w:r>
+      <w:proofErr w:type="spellEnd"/>
+      <w:r>
+        <w:t xml:space="preserve"> Global (Galp) | Lisbon, Portugal| November 2025</w:t>
+      </w:r>
+      <w:r>
+        <w:t xml:space="preserve"> - Present</w:t>
+      </w:r>
+    </w:p>
+    <w:p>
+      <w:pPr>
+        <w:pStyle w:val="ListBullet"/>
+        <w:rPr>
+          <w:sz w:val="20"/>
+          <w:szCs w:val="20"/>
+        </w:rPr>
+      </w:pPr>
+      <w:r>
+        <w:rPr>
+          <w:sz w:val="20"/>
+          <w:szCs w:val="20"/>
+        </w:rPr>
+        <w:t xml:space="preserve">Built and shipped </w:t>
+      </w:r>
+      <w:proofErr w:type="spellStart"/>
+      <w:r>
+        <w:rPr>
+          <w:sz w:val="20"/>
+          <w:szCs w:val="20"/>
+        </w:rPr>
+        <w:t>fullstack</w:t>
+      </w:r>
+      <w:proofErr w:type="spellEnd"/>
+      <w:r>
+        <w:rPr>
+          <w:sz w:val="20"/>
+          <w:szCs w:val="20"/>
+        </w:rPr>
+        <w:t xml:space="preserve"> features with Next.js and </w:t>
+      </w:r>
+      <w:proofErr w:type="spellStart"/>
+      <w:r>
+        <w:rPr>
+          <w:sz w:val="20"/>
+          <w:szCs w:val="20"/>
+        </w:rPr>
+        <w:t>NestJS</w:t>
+      </w:r>
+      <w:proofErr w:type="spellEnd"/>
+      <w:r>
+        <w:rPr>
+          <w:sz w:val="20"/>
+          <w:szCs w:val="20"/>
+        </w:rPr>
+        <w:t>, improving load performance and maintainability across customer-facing modules.</w:t>
+      </w:r>
+    </w:p>
+    <w:p>
+      <w:pPr>
+        <w:pStyle w:val="ListBullet"/>
+        <w:rPr>
+          <w:sz w:val="20"/>
+          <w:szCs w:val="20"/>
+        </w:rPr>
+      </w:pPr>
+      <w:r>
+        <w:rPr>
+          <w:sz w:val="20"/>
+          <w:szCs w:val="20"/>
+        </w:rPr>
+        <w:t>Standardized data access with Prisma across MongoDB, PostgreSQL and MySQL, reducing query-related bugs and speeding up new-feature delivery.</w:t>
+      </w:r>
+    </w:p>
+    <w:p>
+      <w:pPr>
+        <w:pStyle w:val="ListBullet"/>
+        <w:rPr>
+          <w:sz w:val="20"/>
+          <w:szCs w:val="20"/>
+        </w:rPr>
+      </w:pPr>
+      <w:r>
+        <w:rPr>
+          <w:sz w:val="20"/>
+          <w:szCs w:val="20"/>
+        </w:rPr>
+        <w:t>Automated backend workflows with Python Lambdas on AWS, cutting manual file-processing effort.</w:t>
+      </w:r>
+    </w:p>
+    <w:p>
+      <w:pPr>
+        <w:pStyle w:val="ListBullet"/>
+        <w:rPr>
+          <w:sz w:val="20"/>
+          <w:szCs w:val="20"/>
+        </w:rPr>
+      </w:pPr>
+      <w:r>
+        <w:rPr>
+          <w:sz w:val="20"/>
+          <w:szCs w:val="20"/>
+        </w:rPr>
+        <w:t>Managed scalable file storage/processing pipelines via S3, supporting growing data volume without infrastructure rework.</w:t>
+      </w:r>
+    </w:p>
+    <w:p>
+      <w:pPr>
+        <w:pStyle w:val="ListBullet"/>
+        <w:rPr>
+          <w:sz w:val="20"/>
+          <w:szCs w:val="20"/>
+        </w:rPr>
+      </w:pPr>
+      <w:r>
+        <w:rPr>
+          <w:sz w:val="20"/>
+          <w:szCs w:val="20"/>
+        </w:rPr>
+        <w:t>Kept sprint delivery predictable via Confluence documentation and Jira backlog management, improving team visibility.</w:t>
+      </w:r>
+    </w:p>
+    <w:p>
+      <w:pPr>
+        <w:pStyle w:val="ListBullet"/>
+        <w:rPr>
+          <w:sz w:val="20"/>
+          <w:szCs w:val="20"/>
+        </w:rPr>
+      </w:pPr>
+      <w:r>
+        <w:rPr>
+          <w:sz w:val="20"/>
+          <w:szCs w:val="20"/>
+        </w:rPr>
+        <w:t xml:space="preserve">Tech: </w:t>
       </w:r>
       <w:r>
         <w:rPr>
           <w:sz w:val="20"/>
           <w:szCs w:val="20"/>
         </w:rPr>
-        <w:br/>
+        <w:t xml:space="preserve">Next.js, </w:t>
       </w:r>
+      <w:proofErr w:type="spellStart"/>
       <w:r>
         <w:rPr>
           <w:sz w:val="20"/>
           <w:szCs w:val="20"/>
         </w:rPr>
-        <w:br/>
-        <w:t>Hands-on with Next.js, Docker, GitHub Actions, CI/CD pipelines, and cloud deployments (VPS, microservices). Passionate about solving real-world problems, improving delivery pipelines, and continuously learning new technologies.</w:t>
+        <w:t>NestJS</w:t>
       </w:r>
-    </w:p>
-    <w:p>
-      <w:pPr>
-        <w:pStyle w:val="Heading1"/>
-      </w:pPr>
+      <w:proofErr w:type="spellEnd"/>
       <w:r>
-        <w:t>Professional Experience</w:t>
+        <w:rPr>
+          <w:sz w:val="20"/>
+          <w:szCs w:val="20"/>
+        </w:rPr>
+        <w:t>, Prisma, MongoDB, PostgreSQL, MySQL, AWS S3, AWS Lambda, Python, TypeScript, Confluence, Jira.</w:t>
       </w:r>
     </w:p>
     <w:p>
@@ -173,7 +451,7 @@
           <w:sz w:val="20"/>
           <w:szCs w:val="20"/>
         </w:rPr>
-        <w:t>Contributed as Frontend Consultant for Vodafone UK.</w:t>
+        <w:t>Migrated the Device Lifecycle Management (DLM) platform to React, improving UI performance and maintainability over the legacy stack.</w:t>
       </w:r>
     </w:p>
     <w:p>
@@ -189,7 +467,7 @@
           <w:sz w:val="20"/>
           <w:szCs w:val="20"/>
         </w:rPr>
-        <w:t>Migrated the Device Lifecycle Management (DLM) system to React.</w:t>
+        <w:t>Delivered German-language internationalization (i18next), expanding platform usability into a new regional market.</w:t>
       </w:r>
     </w:p>
     <w:p>
@@ -205,39 +483,7 @@
           <w:sz w:val="20"/>
           <w:szCs w:val="20"/>
         </w:rPr>
-        <w:t>Implemented internationalization (i18next), including German language support.</w:t>
-      </w:r>
-    </w:p>
-    <w:p>
-      <w:pPr>
-        <w:pStyle w:val="ListBullet"/>
-        <w:rPr>
-          <w:sz w:val="20"/>
-          <w:szCs w:val="20"/>
-        </w:rPr>
-      </w:pPr>
-      <w:r>
-        <w:rPr>
-          <w:sz w:val="20"/>
-          <w:szCs w:val="20"/>
-        </w:rPr>
-        <w:t xml:space="preserve">Integrated </w:t>
-      </w:r>
-      <w:r>
-        <w:rPr>
-          <w:b/>
-          <w:bCs/>
-          <w:sz w:val="20"/>
-          <w:szCs w:val="20"/>
-        </w:rPr>
-        <w:t>Azure AD (Azure Cloud)</w:t>
-      </w:r>
-      <w:r>
-        <w:rPr>
-          <w:sz w:val="20"/>
-          <w:szCs w:val="20"/>
-        </w:rPr>
-        <w:t xml:space="preserve"> for secure user authentication and session management.</w:t>
+        <w:t>Integrated Azure AD authentication, strengthening session security and aligning the platform with enterprise identity standards.</w:t>
       </w:r>
     </w:p>
     <w:p>
@@ -281,8 +527,14 @@
       <w:pPr>
         <w:pStyle w:val="Heading3"/>
       </w:pPr>
+      <w:proofErr w:type="spellStart"/>
       <w:r>
-        <w:t>FullStack Software Engineer | Integer Consulting | Lisbon, Portugal | May 2022 – Jun 2025</w:t>
+        <w:lastRenderedPageBreak/>
+        <w:t>FullStack</w:t>
+      </w:r>
+      <w:proofErr w:type="spellEnd"/>
+      <w:r>
+        <w:t xml:space="preserve"> Software Engineer | Integer Consulting | Lisbon, Portugal | May 2022 – Jun 2025</w:t>
       </w:r>
     </w:p>
     <w:p>
@@ -293,19 +545,44 @@
           <w:szCs w:val="20"/>
         </w:rPr>
       </w:pPr>
+      <w:proofErr w:type="spellStart"/>
       <w:r>
         <w:rPr>
           <w:sz w:val="20"/>
           <w:szCs w:val="20"/>
         </w:rPr>
-        <w:t xml:space="preserve">Pairpoint: </w:t>
+        <w:t>Pairpoint</w:t>
+      </w:r>
+      <w:proofErr w:type="spellEnd"/>
+      <w:r>
+        <w:rPr>
+          <w:sz w:val="20"/>
+          <w:szCs w:val="20"/>
+        </w:rPr>
+        <w:t xml:space="preserve">: </w:t>
       </w:r>
       <w:r>
         <w:rPr>
           <w:sz w:val="20"/>
           <w:szCs w:val="20"/>
         </w:rPr>
-        <w:t>Developed a product showcase system with a React (TypeScript) frontend and a Tornado (Python) backend, deploying and running the backend services on AWS EC2 instances.</w:t>
+        <w:t xml:space="preserve">Built a product showcase system end-to-end (React/TypeScript + Python/Tornado) deployed on AWS EC2, giving </w:t>
+      </w:r>
+      <w:proofErr w:type="spellStart"/>
+      <w:r>
+        <w:rPr>
+          <w:sz w:val="20"/>
+          <w:szCs w:val="20"/>
+        </w:rPr>
+        <w:t>Pairpoint</w:t>
+      </w:r>
+      <w:proofErr w:type="spellEnd"/>
+      <w:r>
+        <w:rPr>
+          <w:sz w:val="20"/>
+          <w:szCs w:val="20"/>
+        </w:rPr>
+        <w:t xml:space="preserve"> a scalable customer-facing catalog.</w:t>
       </w:r>
     </w:p>
     <w:p>
@@ -321,7 +598,14 @@
           <w:sz w:val="20"/>
           <w:szCs w:val="20"/>
         </w:rPr>
-        <w:t>Vodafone Portugal: Developed Python scripts for AEM page migration and data integrity.</w:t>
+        <w:t xml:space="preserve">Vodafone Portugal: </w:t>
+      </w:r>
+      <w:r>
+        <w:rPr>
+          <w:sz w:val="20"/>
+          <w:szCs w:val="20"/>
+        </w:rPr>
+        <w:t>Developed Python migration scripts for Vodafone Portugal's AEM page migration, preserving data integrity and reducing manual QA effort.</w:t>
       </w:r>
     </w:p>
     <w:p>
@@ -337,7 +621,14 @@
           <w:sz w:val="20"/>
           <w:szCs w:val="20"/>
         </w:rPr>
-        <w:t>Vodafone Portugal: Built reusable components with AEM and Vue.js for corporate website.</w:t>
+        <w:t xml:space="preserve">Vodafone Portugal: </w:t>
+      </w:r>
+      <w:r>
+        <w:rPr>
+          <w:sz w:val="20"/>
+          <w:szCs w:val="20"/>
+        </w:rPr>
+        <w:t>Built reusable AEM/Vue.js components for Vodafone Portugal's corporate site, speeding up delivery of new pages and ensuring UI consistency.</w:t>
       </w:r>
     </w:p>
     <w:p>
@@ -377,11 +668,47 @@
           <w:lang w:val="pt-BR"/>
         </w:rPr>
       </w:pPr>
+      <w:proofErr w:type="spellStart"/>
       <w:r>
         <w:rPr>
           <w:lang w:val="pt-BR"/>
         </w:rPr>
-        <w:t>FullStack Developer | INMET – Instituto Nacional de Meteorologia | Brasília, Brazil | May 2017 – Mar 2022</w:t>
+        <w:t>FullStack</w:t>
+      </w:r>
+      <w:proofErr w:type="spellEnd"/>
+      <w:r>
+        <w:rPr>
+          <w:lang w:val="pt-BR"/>
+        </w:rPr>
+        <w:t xml:space="preserve"> </w:t>
+      </w:r>
+      <w:proofErr w:type="spellStart"/>
+      <w:r>
+        <w:rPr>
+          <w:lang w:val="pt-BR"/>
+        </w:rPr>
+        <w:t>Developer</w:t>
+      </w:r>
+      <w:proofErr w:type="spellEnd"/>
+      <w:r>
+        <w:rPr>
+          <w:lang w:val="pt-BR"/>
+        </w:rPr>
+        <w:t xml:space="preserve"> | INMET – Instituto Nacional de Meteorologia | Brasília, </w:t>
+      </w:r>
+      <w:proofErr w:type="spellStart"/>
+      <w:r>
+        <w:rPr>
+          <w:lang w:val="pt-BR"/>
+        </w:rPr>
+        <w:t>Brazil</w:t>
+      </w:r>
+      <w:proofErr w:type="spellEnd"/>
+      <w:r>
+        <w:rPr>
+          <w:lang w:val="pt-BR"/>
+        </w:rPr>
+        <w:t xml:space="preserve"> | May 2017 – Mar 2022</w:t>
       </w:r>
     </w:p>
     <w:p>
@@ -397,7 +724,7 @@
           <w:sz w:val="20"/>
           <w:szCs w:val="20"/>
         </w:rPr>
-        <w:t>Migrated legacy PHP systems to React and Node.js.</w:t>
+        <w:t>Led migration of legacy PHP systems to React and Node.js, modernizing INMET's public meteorological platforms.</w:t>
       </w:r>
     </w:p>
     <w:p>
@@ -413,7 +740,7 @@
           <w:sz w:val="20"/>
           <w:szCs w:val="20"/>
         </w:rPr>
-        <w:t>Developed INMET mobile app with React Native.</w:t>
+        <w:t>Built the INMET mobile app with React Native, extending weather-forecast access to mobile users across Brazil.</w:t>
       </w:r>
     </w:p>
     <w:p>
@@ -429,7 +756,7 @@
           <w:sz w:val="20"/>
           <w:szCs w:val="20"/>
         </w:rPr>
-        <w:t>Designed and maintained REST APIs for public meteorological data.</w:t>
+        <w:t>Designed and maintained public REST APIs serving meteorological data to external systems and citizens.</w:t>
       </w:r>
     </w:p>
     <w:p>
@@ -445,7 +772,7 @@
           <w:sz w:val="20"/>
           <w:szCs w:val="20"/>
         </w:rPr>
-        <w:t>Built Python scripts for data migration into PostgreSQL/MySQL.</w:t>
+        <w:t>Migrated legacy records to PostgreSQL/MySQL via custom Python scripts, preserving historical data integrity.</w:t>
       </w:r>
     </w:p>
     <w:p>
@@ -471,12 +798,47 @@
           <w:lang w:val="pt-BR"/>
         </w:rPr>
       </w:pPr>
+      <w:proofErr w:type="spellStart"/>
       <w:r>
         <w:rPr>
           <w:lang w:val="pt-BR"/>
         </w:rPr>
-        <w:lastRenderedPageBreak/>
-        <w:t>Internship Web Developer | Senado Federal – Interlegis | Brasília, Brazil | Mar 2015 – Mar 2017</w:t>
+        <w:t>Internship</w:t>
+      </w:r>
+      <w:proofErr w:type="spellEnd"/>
+      <w:r>
+        <w:rPr>
+          <w:lang w:val="pt-BR"/>
+        </w:rPr>
+        <w:t xml:space="preserve"> Web </w:t>
+      </w:r>
+      <w:proofErr w:type="spellStart"/>
+      <w:r>
+        <w:rPr>
+          <w:lang w:val="pt-BR"/>
+        </w:rPr>
+        <w:t>Developer</w:t>
+      </w:r>
+      <w:proofErr w:type="spellEnd"/>
+      <w:r>
+        <w:rPr>
+          <w:lang w:val="pt-BR"/>
+        </w:rPr>
+        <w:t xml:space="preserve"> | Senado Federal – Interlegis | Brasília, </w:t>
+      </w:r>
+      <w:proofErr w:type="spellStart"/>
+      <w:r>
+        <w:rPr>
+          <w:lang w:val="pt-BR"/>
+        </w:rPr>
+        <w:t>Brazil</w:t>
+      </w:r>
+      <w:proofErr w:type="spellEnd"/>
+      <w:r>
+        <w:rPr>
+          <w:lang w:val="pt-BR"/>
+        </w:rPr>
+        <w:t xml:space="preserve"> | Mar 2015 – Mar 2017</w:t>
       </w:r>
     </w:p>
     <w:p>
@@ -492,7 +854,23 @@
           <w:sz w:val="20"/>
           <w:szCs w:val="20"/>
         </w:rPr>
-        <w:t>Maintained LMS Saberes.</w:t>
+        <w:t xml:space="preserve">Maintained the </w:t>
+      </w:r>
+      <w:proofErr w:type="spellStart"/>
+      <w:r>
+        <w:rPr>
+          <w:sz w:val="20"/>
+          <w:szCs w:val="20"/>
+        </w:rPr>
+        <w:t>Saberes</w:t>
+      </w:r>
+      <w:proofErr w:type="spellEnd"/>
+      <w:r>
+        <w:rPr>
+          <w:sz w:val="20"/>
+          <w:szCs w:val="20"/>
+        </w:rPr>
+        <w:t xml:space="preserve"> LMS supporting legislative training programs.</w:t>
       </w:r>
     </w:p>
     <w:p>
@@ -508,23 +886,7 @@
           <w:sz w:val="20"/>
           <w:szCs w:val="20"/>
         </w:rPr>
-        <w:t>Co-developed new SAPL system using Django/Python.</w:t>
-      </w:r>
-    </w:p>
-    <w:p>
-      <w:pPr>
-        <w:pStyle w:val="ListBullet"/>
-        <w:rPr>
-          <w:sz w:val="20"/>
-          <w:szCs w:val="20"/>
-        </w:rPr>
-      </w:pPr>
-      <w:r>
-        <w:rPr>
-          <w:sz w:val="20"/>
-          <w:szCs w:val="20"/>
-        </w:rPr>
-        <w:t>Collaborated with a Scrum team of five developers.</w:t>
+        <w:t>Co-developed the new SAPL system (Django/Python) as part of a 5-person Scrum team, contributing to a legislative management tool used across Brazilian municipalities.</w:t>
       </w:r>
     </w:p>
     <w:p>
@@ -548,7 +910,15 @@
         <w:pStyle w:val="Heading3"/>
       </w:pPr>
       <w:r>
-        <w:t>Internship iOS Developer | BEPiD (Apple Program) | Brasília, Brazil | Jan 2014 – Dec 2014</w:t>
+        <w:t xml:space="preserve">Internship iOS Developer | </w:t>
+      </w:r>
+      <w:proofErr w:type="spellStart"/>
+      <w:r>
+        <w:t>BEPiD</w:t>
+      </w:r>
+      <w:proofErr w:type="spellEnd"/>
+      <w:r>
+        <w:t xml:space="preserve"> (Apple Program) | Brasília, Brazil | Jan 2014 – Dec 2014</w:t>
       </w:r>
     </w:p>
     <w:p>
@@ -564,7 +934,23 @@
           <w:sz w:val="20"/>
           <w:szCs w:val="20"/>
         </w:rPr>
-        <w:t>Developed iOS apps during Apple’s BEPiD program.</w:t>
+        <w:t xml:space="preserve">Developed iOS applications in Objective-C during Apple's year-long </w:t>
+      </w:r>
+      <w:proofErr w:type="spellStart"/>
+      <w:r>
+        <w:rPr>
+          <w:sz w:val="20"/>
+          <w:szCs w:val="20"/>
+        </w:rPr>
+        <w:t>BEPiD</w:t>
+      </w:r>
+      <w:proofErr w:type="spellEnd"/>
+      <w:r>
+        <w:rPr>
+          <w:sz w:val="20"/>
+          <w:szCs w:val="20"/>
+        </w:rPr>
+        <w:t xml:space="preserve"> developer training program.</w:t>
       </w:r>
     </w:p>
     <w:p>
@@ -602,11 +988,33 @@
           <w:lang w:val="pt-BR"/>
         </w:rPr>
       </w:pPr>
+      <w:proofErr w:type="spellStart"/>
       <w:r>
         <w:rPr>
           <w:lang w:val="pt-BR"/>
         </w:rPr>
-        <w:t>Bachelor of Computer Science | Universidade Católica de Brasília | 2013 – 2018</w:t>
+        <w:t>Bachelor</w:t>
+      </w:r>
+      <w:proofErr w:type="spellEnd"/>
+      <w:r>
+        <w:rPr>
+          <w:lang w:val="pt-BR"/>
+        </w:rPr>
+        <w:t xml:space="preserve"> </w:t>
+      </w:r>
+      <w:proofErr w:type="spellStart"/>
+      <w:r>
+        <w:rPr>
+          <w:lang w:val="pt-BR"/>
+        </w:rPr>
+        <w:t>of</w:t>
+      </w:r>
+      <w:proofErr w:type="spellEnd"/>
+      <w:r>
+        <w:rPr>
+          <w:lang w:val="pt-BR"/>
+        </w:rPr>
+        <w:t xml:space="preserve"> Computer Science | Universidade Católica de Brasília | 2013 – 2018</w:t>
       </w:r>
     </w:p>
     <w:p>
@@ -643,419 +1051,27 @@
     </w:p>
     <w:p>
       <w:pPr>
+        <w:pStyle w:val="ListParagraph"/>
+        <w:ind w:left="360"/>
+      </w:pPr>
+    </w:p>
+    <w:p>
+      <w:pPr>
         <w:pStyle w:val="Heading1"/>
-        <w:rPr>
-          <w:rStyle w:val="Heading3Char"/>
-          <w:b/>
-          <w:bCs/>
-          <w:color w:val="365F91" w:themeColor="accent1" w:themeShade="BF"/>
-        </w:rPr>
       </w:pPr>
       <w:r>
+        <w:lastRenderedPageBreak/>
         <w:t>Core Skills</w:t>
       </w:r>
     </w:p>
     <w:p>
       <w:pPr>
-        <w:pStyle w:val="ListBullet"/>
+        <w:pStyle w:val="ListParagraph"/>
         <w:numPr>
           <w:ilvl w:val="0"/>
-          <w:numId w:val="0"/>
-        </w:numPr>
-        <w:ind w:left="360" w:hanging="360"/>
-        <w:rPr>
-          <w:sz w:val="20"/>
-          <w:szCs w:val="20"/>
-        </w:rPr>
-      </w:pPr>
-      <w:r>
-        <w:rPr>
-          <w:rStyle w:val="Heading3Char"/>
-        </w:rPr>
-        <w:t>Frontend</w:t>
-      </w:r>
-    </w:p>
-    <w:p>
-      <w:pPr>
-        <w:pStyle w:val="ListBullet"/>
-        <w:rPr>
-          <w:sz w:val="20"/>
-          <w:szCs w:val="20"/>
-        </w:rPr>
-      </w:pPr>
-      <w:r>
-        <w:rPr>
-          <w:sz w:val="20"/>
-          <w:szCs w:val="20"/>
-        </w:rPr>
-        <w:t>React (8+ years), JavaScript (10+ years), TypeScript (6+ years)</w:t>
-      </w:r>
-    </w:p>
-    <w:p>
-      <w:pPr>
-        <w:pStyle w:val="ListBullet"/>
-        <w:rPr>
-          <w:sz w:val="20"/>
-          <w:szCs w:val="20"/>
-        </w:rPr>
-      </w:pPr>
-      <w:r>
-        <w:rPr>
-          <w:sz w:val="20"/>
-          <w:szCs w:val="20"/>
-        </w:rPr>
-        <w:t>HTML5 &amp; CSS3 (10+ years), Sass (5 years)</w:t>
-      </w:r>
-    </w:p>
-    <w:p>
-      <w:pPr>
-        <w:pStyle w:val="ListBullet"/>
-        <w:rPr>
-          <w:sz w:val="20"/>
-          <w:szCs w:val="20"/>
-        </w:rPr>
-      </w:pPr>
-      <w:r>
-        <w:rPr>
-          <w:sz w:val="20"/>
-          <w:szCs w:val="20"/>
-        </w:rPr>
-        <w:t>Redux / Context API (4 years), Vue.js (1 year)</w:t>
-      </w:r>
-    </w:p>
-    <w:p>
-      <w:pPr>
-        <w:pStyle w:val="ListBullet"/>
-        <w:rPr>
-          <w:sz w:val="20"/>
-          <w:szCs w:val="20"/>
-        </w:rPr>
-      </w:pPr>
-      <w:r>
-        <w:rPr>
-          <w:sz w:val="20"/>
-          <w:szCs w:val="20"/>
-        </w:rPr>
-        <w:t>React Native (2 years), i18next &amp; Internationalization (1 year)</w:t>
-      </w:r>
-    </w:p>
-    <w:p>
-      <w:pPr>
-        <w:pStyle w:val="ListBullet"/>
-        <w:numPr>
-          <w:ilvl w:val="0"/>
-          <w:numId w:val="0"/>
+          <w:numId w:val="14"/>
         </w:numPr>
         <w:rPr>
-          <w:rStyle w:val="Heading3Char"/>
-        </w:rPr>
-      </w:pPr>
-    </w:p>
-    <w:p>
-      <w:pPr>
-        <w:pStyle w:val="ListBullet"/>
-        <w:numPr>
-          <w:ilvl w:val="0"/>
-          <w:numId w:val="0"/>
-        </w:numPr>
-        <w:rPr>
-          <w:sz w:val="20"/>
-          <w:szCs w:val="20"/>
-        </w:rPr>
-      </w:pPr>
-      <w:r>
-        <w:rPr>
-          <w:rStyle w:val="Heading3Char"/>
-        </w:rPr>
-        <w:t>Backend</w:t>
-      </w:r>
-    </w:p>
-    <w:p>
-      <w:pPr>
-        <w:pStyle w:val="ListBullet"/>
-        <w:rPr>
-          <w:sz w:val="20"/>
-          <w:szCs w:val="20"/>
-        </w:rPr>
-      </w:pPr>
-      <w:r>
-        <w:rPr>
-          <w:sz w:val="20"/>
-          <w:szCs w:val="20"/>
-        </w:rPr>
-        <w:t>Python (8 years) – Tornado (2 years), Django (3 years)</w:t>
-      </w:r>
-    </w:p>
-    <w:p>
-      <w:pPr>
-        <w:pStyle w:val="ListBullet"/>
-        <w:rPr>
-          <w:sz w:val="20"/>
-          <w:szCs w:val="20"/>
-        </w:rPr>
-      </w:pPr>
-      <w:r>
-        <w:rPr>
-          <w:sz w:val="20"/>
-          <w:szCs w:val="20"/>
-        </w:rPr>
-        <w:t>Node.js / AdonisJS (5 years), REST APIs (8 years)</w:t>
-      </w:r>
-    </w:p>
-    <w:p>
-      <w:pPr>
-        <w:pStyle w:val="ListBullet"/>
-        <w:rPr>
-          <w:sz w:val="20"/>
-          <w:szCs w:val="20"/>
-          <w:lang w:val="pt-BR"/>
-        </w:rPr>
-      </w:pPr>
-      <w:r>
-        <w:rPr>
-          <w:sz w:val="20"/>
-          <w:szCs w:val="20"/>
-          <w:lang w:val="pt-BR"/>
-        </w:rPr>
-        <w:t>PHP (4 years</w:t>
-      </w:r>
-      <w:r>
-        <w:rPr>
-          <w:sz w:val="20"/>
-          <w:szCs w:val="20"/>
-          <w:lang w:val="pt-BR"/>
-        </w:rPr>
-        <w:t>)</w:t>
-      </w:r>
-    </w:p>
-    <w:p>
-      <w:pPr>
-        <w:pStyle w:val="ListBullet"/>
-        <w:numPr>
-          <w:ilvl w:val="0"/>
-          <w:numId w:val="0"/>
-        </w:numPr>
-        <w:rPr>
-          <w:rStyle w:val="Heading3Char"/>
-          <w:rFonts w:asciiTheme="minorHAnsi" w:eastAsiaTheme="minorEastAsia" w:hAnsiTheme="minorHAnsi" w:cstheme="minorBidi"/>
-          <w:b w:val="0"/>
-          <w:bCs w:val="0"/>
-          <w:color w:val="auto"/>
-          <w:sz w:val="20"/>
-          <w:szCs w:val="20"/>
-        </w:rPr>
-      </w:pPr>
-    </w:p>
-    <w:p>
-      <w:pPr>
-        <w:pStyle w:val="ListBullet"/>
-        <w:numPr>
-          <w:ilvl w:val="0"/>
-          <w:numId w:val="0"/>
-        </w:numPr>
-        <w:rPr>
-          <w:sz w:val="20"/>
-          <w:szCs w:val="20"/>
-        </w:rPr>
-      </w:pPr>
-      <w:r>
-        <w:rPr>
-          <w:rStyle w:val="Heading3Char"/>
-        </w:rPr>
-        <w:t>Cloud &amp; DevOps</w:t>
-      </w:r>
-    </w:p>
-    <w:p>
-      <w:pPr>
-        <w:pStyle w:val="ListBullet"/>
-        <w:rPr>
-          <w:sz w:val="20"/>
-          <w:szCs w:val="20"/>
-        </w:rPr>
-      </w:pPr>
-      <w:r>
-        <w:rPr>
-          <w:sz w:val="20"/>
-          <w:szCs w:val="20"/>
-        </w:rPr>
-        <w:t>AWS EC2 (1 year) – Deploy &amp; Hosting</w:t>
-      </w:r>
-    </w:p>
-    <w:p>
-      <w:pPr>
-        <w:pStyle w:val="ListBullet"/>
-        <w:rPr>
-          <w:sz w:val="20"/>
-          <w:szCs w:val="20"/>
-        </w:rPr>
-      </w:pPr>
-      <w:r>
-        <w:rPr>
-          <w:sz w:val="20"/>
-          <w:szCs w:val="20"/>
-        </w:rPr>
-        <w:t>Azure AD (1 year) – Authentication &amp; Identity</w:t>
-      </w:r>
-    </w:p>
-    <w:p>
-      <w:pPr>
-        <w:pStyle w:val="ListBullet"/>
-        <w:rPr>
-          <w:sz w:val="20"/>
-          <w:szCs w:val="20"/>
-        </w:rPr>
-      </w:pPr>
-      <w:r>
-        <w:rPr>
-          <w:sz w:val="20"/>
-          <w:szCs w:val="20"/>
-        </w:rPr>
-        <w:t>Docker, GitHub Actions, CI/CD Pipelines (3+ years)</w:t>
-      </w:r>
-    </w:p>
-    <w:p>
-      <w:pPr>
-        <w:pStyle w:val="ListBullet"/>
-        <w:numPr>
-          <w:ilvl w:val="0"/>
-          <w:numId w:val="0"/>
-        </w:numPr>
-        <w:ind w:left="360" w:hanging="360"/>
-        <w:rPr>
-          <w:rStyle w:val="Heading3Char"/>
-        </w:rPr>
-      </w:pPr>
-    </w:p>
-    <w:p>
-      <w:pPr>
-        <w:pStyle w:val="ListBullet"/>
-        <w:numPr>
-          <w:ilvl w:val="0"/>
-          <w:numId w:val="0"/>
-        </w:numPr>
-        <w:ind w:left="360" w:hanging="360"/>
-        <w:rPr>
-          <w:rStyle w:val="Heading3Char"/>
-          <w:rFonts w:asciiTheme="minorHAnsi" w:eastAsiaTheme="minorEastAsia" w:hAnsiTheme="minorHAnsi" w:cstheme="minorBidi"/>
-          <w:b w:val="0"/>
-          <w:bCs w:val="0"/>
-          <w:color w:val="auto"/>
-          <w:sz w:val="20"/>
-          <w:szCs w:val="20"/>
-        </w:rPr>
-      </w:pPr>
-      <w:r>
-        <w:rPr>
-          <w:rStyle w:val="Heading3Char"/>
-        </w:rPr>
-        <w:t>Databases</w:t>
-      </w:r>
-    </w:p>
-    <w:p>
-      <w:pPr>
-        <w:pStyle w:val="ListBullet"/>
-        <w:rPr>
-          <w:sz w:val="20"/>
-          <w:szCs w:val="20"/>
-        </w:rPr>
-      </w:pPr>
-      <w:r>
-        <w:rPr>
-          <w:sz w:val="20"/>
-          <w:szCs w:val="20"/>
-        </w:rPr>
-        <w:t>PostgreSQL (6 years), MySQL (4 years), MongoDB (1 year)</w:t>
-      </w:r>
-    </w:p>
-    <w:p>
-      <w:pPr>
-        <w:pStyle w:val="ListBullet"/>
-        <w:rPr>
-          <w:sz w:val="20"/>
-          <w:szCs w:val="20"/>
-          <w:lang w:val="pt-BR"/>
-        </w:rPr>
-      </w:pPr>
-      <w:r>
-        <w:rPr>
-          <w:sz w:val="20"/>
-          <w:szCs w:val="20"/>
-          <w:lang w:val="pt-BR"/>
-        </w:rPr>
-        <w:t>Data migration &amp; SQL optimization</w:t>
-      </w:r>
-    </w:p>
-    <w:p>
-      <w:pPr>
-        <w:pStyle w:val="ListBullet"/>
-        <w:numPr>
-          <w:ilvl w:val="0"/>
-          <w:numId w:val="0"/>
-        </w:numPr>
-        <w:ind w:left="360" w:hanging="360"/>
-        <w:rPr>
-          <w:rStyle w:val="Heading3Char"/>
-        </w:rPr>
-      </w:pPr>
-    </w:p>
-    <w:p>
-      <w:pPr>
-        <w:pStyle w:val="ListBullet"/>
-        <w:numPr>
-          <w:ilvl w:val="0"/>
-          <w:numId w:val="0"/>
-        </w:numPr>
-        <w:ind w:left="360" w:hanging="360"/>
-        <w:rPr>
-          <w:rStyle w:val="Heading3Char"/>
-        </w:rPr>
-      </w:pPr>
-    </w:p>
-    <w:p>
-      <w:pPr>
-        <w:pStyle w:val="ListBullet"/>
-        <w:numPr>
-          <w:ilvl w:val="0"/>
-          <w:numId w:val="0"/>
-        </w:numPr>
-        <w:ind w:left="360" w:hanging="360"/>
-        <w:rPr>
-          <w:rStyle w:val="Heading3Char"/>
-        </w:rPr>
-      </w:pPr>
-    </w:p>
-    <w:p>
-      <w:pPr>
-        <w:pStyle w:val="ListBullet"/>
-        <w:numPr>
-          <w:ilvl w:val="0"/>
-          <w:numId w:val="0"/>
-        </w:numPr>
-        <w:ind w:left="360" w:hanging="360"/>
-        <w:rPr>
-          <w:rStyle w:val="Heading3Char"/>
-          <w:rFonts w:asciiTheme="minorHAnsi" w:eastAsiaTheme="minorEastAsia" w:hAnsiTheme="minorHAnsi" w:cstheme="minorBidi"/>
-          <w:b w:val="0"/>
-          <w:bCs w:val="0"/>
-          <w:color w:val="auto"/>
-          <w:sz w:val="20"/>
-          <w:szCs w:val="20"/>
-        </w:rPr>
-      </w:pPr>
-      <w:r>
-        <w:rPr>
-          <w:rStyle w:val="Heading3Char"/>
-        </w:rPr>
-        <w:lastRenderedPageBreak/>
-        <w:t>Methodologies &amp; Architecture</w:t>
-      </w:r>
-    </w:p>
-    <w:p>
-      <w:pPr>
-        <w:pStyle w:val="ListBullet"/>
-        <w:rPr>
-          <w:b/>
-          <w:bCs/>
           <w:sz w:val="20"/>
           <w:szCs w:val="20"/>
         </w:rPr>
@@ -1067,18 +1083,26 @@
           <w:sz w:val="20"/>
           <w:szCs w:val="20"/>
         </w:rPr>
-        <w:t>Agile (Scrum/Kanban) (3+ years)</w:t>
+        <w:t>Frontend:</w:t>
+      </w:r>
+      <w:r>
+        <w:rPr>
+          <w:sz w:val="20"/>
+          <w:szCs w:val="20"/>
+        </w:rPr>
+        <w:t xml:space="preserve"> React, Next.js, Vue.js, React Native, Redux, Context API, TypeScript, JavaScript, HTML5, CSS3, Sass, i18next</w:t>
       </w:r>
     </w:p>
     <w:p>
       <w:pPr>
-        <w:pStyle w:val="ListBullet"/>
+        <w:pStyle w:val="ListParagraph"/>
+        <w:numPr>
+          <w:ilvl w:val="0"/>
+          <w:numId w:val="14"/>
+        </w:numPr>
         <w:rPr>
-          <w:b/>
-          <w:bCs/>
           <w:sz w:val="20"/>
           <w:szCs w:val="20"/>
-          <w:lang w:val="pt-BR"/>
         </w:rPr>
       </w:pPr>
       <w:r>
@@ -1088,7 +1112,133 @@
           <w:sz w:val="20"/>
           <w:szCs w:val="20"/>
         </w:rPr>
-        <w:t>Legacy system migration &amp; clean code practices</w:t>
+        <w:t>Backend:</w:t>
+      </w:r>
+      <w:r>
+        <w:rPr>
+          <w:sz w:val="20"/>
+          <w:szCs w:val="20"/>
+        </w:rPr>
+        <w:t xml:space="preserve"> Node.js, </w:t>
+      </w:r>
+      <w:proofErr w:type="spellStart"/>
+      <w:r>
+        <w:rPr>
+          <w:sz w:val="20"/>
+          <w:szCs w:val="20"/>
+        </w:rPr>
+        <w:t>NestJS</w:t>
+      </w:r>
+      <w:proofErr w:type="spellEnd"/>
+      <w:r>
+        <w:rPr>
+          <w:sz w:val="20"/>
+          <w:szCs w:val="20"/>
+        </w:rPr>
+        <w:t xml:space="preserve">, Python (Tornado, Django), </w:t>
+      </w:r>
+      <w:proofErr w:type="spellStart"/>
+      <w:r>
+        <w:rPr>
+          <w:sz w:val="20"/>
+          <w:szCs w:val="20"/>
+        </w:rPr>
+        <w:t>AdonisJS</w:t>
+      </w:r>
+      <w:proofErr w:type="spellEnd"/>
+      <w:r>
+        <w:rPr>
+          <w:sz w:val="20"/>
+          <w:szCs w:val="20"/>
+        </w:rPr>
+        <w:t>, PHP, REST APIs</w:t>
+      </w:r>
+    </w:p>
+    <w:p>
+      <w:pPr>
+        <w:pStyle w:val="ListParagraph"/>
+        <w:numPr>
+          <w:ilvl w:val="0"/>
+          <w:numId w:val="14"/>
+        </w:numPr>
+        <w:rPr>
+          <w:sz w:val="20"/>
+          <w:szCs w:val="20"/>
+        </w:rPr>
+      </w:pPr>
+      <w:r>
+        <w:rPr>
+          <w:b/>
+          <w:bCs/>
+          <w:sz w:val="20"/>
+          <w:szCs w:val="20"/>
+        </w:rPr>
+        <w:t>Databases:</w:t>
+      </w:r>
+      <w:r>
+        <w:rPr>
+          <w:sz w:val="20"/>
+          <w:szCs w:val="20"/>
+        </w:rPr>
+        <w:t xml:space="preserve"> PostgreSQL, MySQL, MongoDB</w:t>
+      </w:r>
+    </w:p>
+    <w:p>
+      <w:pPr>
+        <w:pStyle w:val="ListParagraph"/>
+        <w:numPr>
+          <w:ilvl w:val="0"/>
+          <w:numId w:val="14"/>
+        </w:numPr>
+        <w:rPr>
+          <w:sz w:val="20"/>
+          <w:szCs w:val="20"/>
+        </w:rPr>
+      </w:pPr>
+      <w:r>
+        <w:rPr>
+          <w:b/>
+          <w:bCs/>
+          <w:sz w:val="20"/>
+          <w:szCs w:val="20"/>
+        </w:rPr>
+        <w:t>Cloud &amp; DevOps:</w:t>
+      </w:r>
+      <w:r>
+        <w:rPr>
+          <w:sz w:val="20"/>
+          <w:szCs w:val="20"/>
+        </w:rPr>
+        <w:t xml:space="preserve"> AWS (EC2, S3, Lambda), Azure AD, Docker, GitHub Actions, CI/CD</w:t>
+      </w:r>
+    </w:p>
+    <w:p>
+      <w:pPr>
+        <w:pStyle w:val="ListParagraph"/>
+        <w:numPr>
+          <w:ilvl w:val="0"/>
+          <w:numId w:val="14"/>
+        </w:numPr>
+        <w:rPr>
+          <w:sz w:val="20"/>
+          <w:szCs w:val="20"/>
+        </w:rPr>
+      </w:pPr>
+      <w:r>
+        <w:rPr>
+          <w:b/>
+          <w:bCs/>
+          <w:sz w:val="20"/>
+          <w:szCs w:val="20"/>
+        </w:rPr>
+        <w:t>Methodologies:</w:t>
+      </w:r>
+      <w:r>
+        <w:rPr>
+          <w:sz w:val="20"/>
+          <w:szCs w:val="20"/>
+        </w:rPr>
+        <w:t xml:space="preserve"> Agile (Scrum/Kanban), Legacy System Migration, Internationalization (i18n)</w:t>
       </w:r>
     </w:p>
     <w:p/>
@@ -1257,7 +1407,7 @@
   <w:abstractNum w:abstractNumId="8" w15:restartNumberingAfterBreak="0">
     <w:nsid w:val="FFFFFF89"/>
     <w:multiLevelType w:val="singleLevel"/>
-    <w:tmpl w:val="DACEA406"/>
+    <w:tmpl w:val="3F9EDF06"/>
     <w:lvl w:ilvl="0">
       <w:start w:val="1"/>
       <w:numFmt w:val="bullet"/>
@@ -1615,6 +1765,119 @@
     </w:lvl>
   </w:abstractNum>
   <w:abstractNum w:abstractNumId="12" w15:restartNumberingAfterBreak="0">
+    <w:nsid w:val="513A6509"/>
+    <w:multiLevelType w:val="hybridMultilevel"/>
+    <w:tmpl w:val="B4AA675A"/>
+    <w:lvl w:ilvl="0" w:tplc="04160001">
+      <w:start w:val="1"/>
+      <w:numFmt w:val="bullet"/>
+      <w:lvlText w:val=""/>
+      <w:lvlJc w:val="left"/>
+      <w:pPr>
+        <w:ind w:left="360" w:hanging="360"/>
+      </w:pPr>
+      <w:rPr>
+        <w:rFonts w:ascii="Symbol" w:hAnsi="Symbol" w:hint="default"/>
+      </w:rPr>
+    </w:lvl>
+    <w:lvl w:ilvl="1" w:tplc="04160003" w:tentative="1">
+      <w:start w:val="1"/>
+      <w:numFmt w:val="bullet"/>
+      <w:lvlText w:val="o"/>
+      <w:lvlJc w:val="left"/>
+      <w:pPr>
+        <w:ind w:left="1080" w:hanging="360"/>
+      </w:pPr>
+      <w:rPr>
+        <w:rFonts w:ascii="Courier New" w:hAnsi="Courier New" w:cs="Courier New" w:hint="default"/>
+      </w:rPr>
+    </w:lvl>
+    <w:lvl w:ilvl="2" w:tplc="04160005" w:tentative="1">
+      <w:start w:val="1"/>
+      <w:numFmt w:val="bullet"/>
+      <w:lvlText w:val=""/>
+      <w:lvlJc w:val="left"/>
+      <w:pPr>
+        <w:ind w:left="1800" w:hanging="360"/>
+      </w:pPr>
+      <w:rPr>
+        <w:rFonts w:ascii="Wingdings" w:hAnsi="Wingdings" w:hint="default"/>
+      </w:rPr>
+    </w:lvl>
+    <w:lvl w:ilvl="3" w:tplc="04160001" w:tentative="1">
+      <w:start w:val="1"/>
+      <w:numFmt w:val="bullet"/>
+      <w:lvlText w:val=""/>
+      <w:lvlJc w:val="left"/>
+      <w:pPr>
+        <w:ind w:left="2520" w:hanging="360"/>
+      </w:pPr>
+      <w:rPr>
+        <w:rFonts w:ascii="Symbol" w:hAnsi="Symbol" w:hint="default"/>
+      </w:rPr>
+    </w:lvl>
+    <w:lvl w:ilvl="4" w:tplc="04160003" w:tentative="1">
+      <w:start w:val="1"/>
+      <w:numFmt w:val="bullet"/>
+      <w:lvlText w:val="o"/>
+      <w:lvlJc w:val="left"/>
+      <w:pPr>
+        <w:ind w:left="3240" w:hanging="360"/>
+      </w:pPr>
+      <w:rPr>
+        <w:rFonts w:ascii="Courier New" w:hAnsi="Courier New" w:cs="Courier New" w:hint="default"/>
+      </w:rPr>
+    </w:lvl>
+    <w:lvl w:ilvl="5" w:tplc="04160005" w:tentative="1">
+      <w:start w:val="1"/>
+      <w:numFmt w:val="bullet"/>
+      <w:lvlText w:val=""/>
+      <w:lvlJc w:val="left"/>
+      <w:pPr>
+        <w:ind w:left="3960" w:hanging="360"/>
+      </w:pPr>
+      <w:rPr>
+        <w:rFonts w:ascii="Wingdings" w:hAnsi="Wingdings" w:hint="default"/>
+      </w:rPr>
+    </w:lvl>
+    <w:lvl w:ilvl="6" w:tplc="04160001" w:tentative="1">
+      <w:start w:val="1"/>
+      <w:numFmt w:val="bullet"/>
+      <w:lvlText w:val=""/>
+      <w:lvlJc w:val="left"/>
+      <w:pPr>
+        <w:ind w:left="4680" w:hanging="360"/>
+      </w:pPr>
+      <w:rPr>
+        <w:rFonts w:ascii="Symbol" w:hAnsi="Symbol" w:hint="default"/>
+      </w:rPr>
+    </w:lvl>
+    <w:lvl w:ilvl="7" w:tplc="04160003" w:tentative="1">
+      <w:start w:val="1"/>
+      <w:numFmt w:val="bullet"/>
+      <w:lvlText w:val="o"/>
+      <w:lvlJc w:val="left"/>
+      <w:pPr>
+        <w:ind w:left="5400" w:hanging="360"/>
+      </w:pPr>
+      <w:rPr>
+        <w:rFonts w:ascii="Courier New" w:hAnsi="Courier New" w:cs="Courier New" w:hint="default"/>
+      </w:rPr>
+    </w:lvl>
+    <w:lvl w:ilvl="8" w:tplc="04160005" w:tentative="1">
+      <w:start w:val="1"/>
+      <w:numFmt w:val="bullet"/>
+      <w:lvlText w:val=""/>
+      <w:lvlJc w:val="left"/>
+      <w:pPr>
+        <w:ind w:left="6120" w:hanging="360"/>
+      </w:pPr>
+      <w:rPr>
+        <w:rFonts w:ascii="Wingdings" w:hAnsi="Wingdings" w:hint="default"/>
+      </w:rPr>
+    </w:lvl>
+  </w:abstractNum>
+  <w:abstractNum w:abstractNumId="13" w15:restartNumberingAfterBreak="0">
     <w:nsid w:val="549B00AC"/>
     <w:multiLevelType w:val="hybridMultilevel"/>
     <w:tmpl w:val="0874A760"/>
@@ -1764,6 +2027,9 @@
     <w:abstractNumId w:val="9"/>
   </w:num>
   <w:num w:numId="13" w16cid:durableId="2004431837">
+    <w:abstractNumId w:val="13"/>
+  </w:num>
+  <w:num w:numId="14" w16cid:durableId="1823503956">
     <w:abstractNumId w:val="12"/>
   </w:num>
 </w:numbering>
@@ -13171,6 +13437,18 @@
       <w:shd w:val="clear" w:color="auto" w:fill="E1DFDD"/>
     </w:rPr>
   </w:style>
+  <w:style w:type="character" w:styleId="FollowedHyperlink">
+    <w:name w:val="FollowedHyperlink"/>
+    <w:basedOn w:val="DefaultParagraphFont"/>
+    <w:uiPriority w:val="99"/>
+    <w:semiHidden/>
+    <w:unhideWhenUsed/>
+    <w:rsid w:val="0078047A"/>
+    <w:rPr>
+      <w:color w:val="800080" w:themeColor="followedHyperlink"/>
+      <w:u w:val="single"/>
+    </w:rPr>
+  </w:style>
 </w:styles>
 </file>
 

</xml_diff>